<commit_message>
new updated first merit list
</commit_message>
<xml_diff>
--- a/merit/2022/july/first/fcpsd.docx
+++ b/merit/2022/july/first/fcpsd.docx
@@ -6,26 +6,25 @@
       <w:tblPr>
         <w:tblStyle w:val="TableGrid"/>
         <w:tblW w:w="0" w:type="auto"/>
-        <w:tblInd w:w="-882" w:type="dxa"/>
+        <w:tblInd w:w="-792" w:type="dxa"/>
         <w:tblLook w:val="04A0" w:firstRow="1" w:lastRow="0" w:firstColumn="1" w:lastColumn="0" w:noHBand="0" w:noVBand="1"/>
       </w:tblPr>
       <w:tblGrid>
-        <w:gridCol w:w="407"/>
-        <w:gridCol w:w="420"/>
-        <w:gridCol w:w="925"/>
-        <w:gridCol w:w="966"/>
-        <w:gridCol w:w="751"/>
-        <w:gridCol w:w="1098"/>
-        <w:gridCol w:w="1015"/>
-        <w:gridCol w:w="1017"/>
-        <w:gridCol w:w="1335"/>
-        <w:gridCol w:w="1074"/>
-        <w:gridCol w:w="730"/>
+        <w:gridCol w:w="416"/>
+        <w:gridCol w:w="957"/>
+        <w:gridCol w:w="1001"/>
+        <w:gridCol w:w="776"/>
+        <w:gridCol w:w="1138"/>
+        <w:gridCol w:w="1052"/>
+        <w:gridCol w:w="1054"/>
+        <w:gridCol w:w="1387"/>
+        <w:gridCol w:w="1114"/>
+        <w:gridCol w:w="753"/>
       </w:tblGrid>
       <w:tr>
         <w:tc>
           <w:tcPr>
-            <w:tcW w:w="1267" w:type="dxa"/>
+            <w:tcW w:w="406" w:type="dxa"/>
           </w:tcPr>
           <w:p>
             <w:r>
@@ -35,17 +34,7 @@
         </w:tc>
         <w:tc>
           <w:tcPr>
-            <w:tcW w:w="395" w:type="dxa"/>
-          </w:tcPr>
-          <w:p>
-            <w:r>
-              <w:t>Rn</w:t>
-            </w:r>
-          </w:p>
-        </w:tc>
-        <w:tc>
-          <w:tcPr>
-            <w:tcW w:w="840" w:type="dxa"/>
+            <w:tcW w:w="916" w:type="dxa"/>
           </w:tcPr>
           <w:p>
             <w:r>
@@ -55,7 +44,7 @@
         </w:tc>
         <w:tc>
           <w:tcPr>
-            <w:tcW w:w="876" w:type="dxa"/>
+            <w:tcW w:w="957" w:type="dxa"/>
           </w:tcPr>
           <w:p>
             <w:r>
@@ -65,7 +54,7 @@
         </w:tc>
         <w:tc>
           <w:tcPr>
-            <w:tcW w:w="687" w:type="dxa"/>
+            <w:tcW w:w="744" w:type="dxa"/>
           </w:tcPr>
           <w:p>
             <w:r>
@@ -75,7 +64,7 @@
         </w:tc>
         <w:tc>
           <w:tcPr>
-            <w:tcW w:w="992" w:type="dxa"/>
+            <w:tcW w:w="1087" w:type="dxa"/>
           </w:tcPr>
           <w:p>
             <w:r>
@@ -85,7 +74,7 @@
         </w:tc>
         <w:tc>
           <w:tcPr>
-            <w:tcW w:w="919" w:type="dxa"/>
+            <w:tcW w:w="1005" w:type="dxa"/>
           </w:tcPr>
           <w:p>
             <w:r>
@@ -95,7 +84,7 @@
         </w:tc>
         <w:tc>
           <w:tcPr>
-            <w:tcW w:w="921" w:type="dxa"/>
+            <w:tcW w:w="1007" w:type="dxa"/>
           </w:tcPr>
           <w:p>
             <w:r>
@@ -105,7 +94,7 @@
         </w:tc>
         <w:tc>
           <w:tcPr>
-            <w:tcW w:w="1201" w:type="dxa"/>
+            <w:tcW w:w="1321" w:type="dxa"/>
           </w:tcPr>
           <w:p>
             <w:r>
@@ -115,7 +104,7 @@
         </w:tc>
         <w:tc>
           <w:tcPr>
-            <w:tcW w:w="972" w:type="dxa"/>
+            <w:tcW w:w="1064" w:type="dxa"/>
           </w:tcPr>
           <w:p>
             <w:r>
@@ -125,7 +114,7 @@
         </w:tc>
         <w:tc>
           <w:tcPr>
-            <w:tcW w:w="668" w:type="dxa"/>
+            <w:tcW w:w="723" w:type="dxa"/>
           </w:tcPr>
           <w:p>
             <w:r>
@@ -137,7 +126,7 @@
       <w:tr>
         <w:tc>
           <w:tcPr>
-            <w:tcW w:w="1267" w:type="dxa"/>
+            <w:tcW w:w="406" w:type="dxa"/>
           </w:tcPr>
           <w:p>
             <w:r>
@@ -147,7 +136,57 @@
         </w:tc>
         <w:tc>
           <w:tcPr>
-            <w:tcW w:w="395" w:type="dxa"/>
+            <w:tcW w:w="916" w:type="dxa"/>
+          </w:tcPr>
+          <w:p>
+            <w:r>
+              <w:t>2244</w:t>
+            </w:r>
+          </w:p>
+        </w:tc>
+        <w:tc>
+          <w:tcPr>
+            <w:tcW w:w="957" w:type="dxa"/>
+          </w:tcPr>
+          <w:p>
+            <w:r>
+              <w:t>Ali Imran</w:t>
+            </w:r>
+          </w:p>
+        </w:tc>
+        <w:tc>
+          <w:tcPr>
+            <w:tcW w:w="744" w:type="dxa"/>
+          </w:tcPr>
+          <w:p>
+            <w:r>
+              <w:t>21998-D</w:t>
+            </w:r>
+          </w:p>
+        </w:tc>
+        <w:tc>
+          <w:tcPr>
+            <w:tcW w:w="1087" w:type="dxa"/>
+          </w:tcPr>
+          <w:p>
+            <w:r>
+              <w:t>Muhammad Afzal Khan</w:t>
+            </w:r>
+          </w:p>
+        </w:tc>
+        <w:tc>
+          <w:tcPr>
+            <w:tcW w:w="1005" w:type="dxa"/>
+          </w:tcPr>
+          <w:p>
+            <w:r>
+              <w:t>73.177143</w:t>
+            </w:r>
+          </w:p>
+        </w:tc>
+        <w:tc>
+          <w:tcPr>
+            <w:tcW w:w="1007" w:type="dxa"/>
           </w:tcPr>
           <w:p>
             <w:r>
@@ -157,67 +196,7 @@
         </w:tc>
         <w:tc>
           <w:tcPr>
-            <w:tcW w:w="840" w:type="dxa"/>
-          </w:tcPr>
-          <w:p>
-            <w:r>
-              <w:t>2244</w:t>
-            </w:r>
-          </w:p>
-        </w:tc>
-        <w:tc>
-          <w:tcPr>
-            <w:tcW w:w="876" w:type="dxa"/>
-          </w:tcPr>
-          <w:p>
-            <w:r>
-              <w:t>Ali Imran</w:t>
-            </w:r>
-          </w:p>
-        </w:tc>
-        <w:tc>
-          <w:tcPr>
-            <w:tcW w:w="687" w:type="dxa"/>
-          </w:tcPr>
-          <w:p>
-            <w:r>
-              <w:t>21998-D</w:t>
-            </w:r>
-          </w:p>
-        </w:tc>
-        <w:tc>
-          <w:tcPr>
-            <w:tcW w:w="992" w:type="dxa"/>
-          </w:tcPr>
-          <w:p>
-            <w:r>
-              <w:t>Muhammad Afzal Khan</w:t>
-            </w:r>
-          </w:p>
-        </w:tc>
-        <w:tc>
-          <w:tcPr>
-            <w:tcW w:w="919" w:type="dxa"/>
-          </w:tcPr>
-          <w:p>
-            <w:r>
-              <w:t>73.177143</w:t>
-            </w:r>
-          </w:p>
-        </w:tc>
-        <w:tc>
-          <w:tcPr>
-            <w:tcW w:w="921" w:type="dxa"/>
-          </w:tcPr>
-          <w:p>
-            <w:r>
-              <w:t>1</w:t>
-            </w:r>
-          </w:p>
-        </w:tc>
-        <w:tc>
-          <w:tcPr>
-            <w:tcW w:w="1201" w:type="dxa"/>
+            <w:tcW w:w="1321" w:type="dxa"/>
           </w:tcPr>
           <w:p>
             <w:r>
@@ -227,7 +206,7 @@
         </w:tc>
         <w:tc>
           <w:tcPr>
-            <w:tcW w:w="972" w:type="dxa"/>
+            <w:tcW w:w="1064" w:type="dxa"/>
           </w:tcPr>
           <w:p>
             <w:r>
@@ -237,7 +216,7 @@
         </w:tc>
         <w:tc>
           <w:tcPr>
-            <w:tcW w:w="668" w:type="dxa"/>
+            <w:tcW w:w="723" w:type="dxa"/>
           </w:tcPr>
           <w:p>
             <w:r>
@@ -249,7 +228,7 @@
       <w:tr>
         <w:tc>
           <w:tcPr>
-            <w:tcW w:w="1267" w:type="dxa"/>
+            <w:tcW w:w="406" w:type="dxa"/>
           </w:tcPr>
           <w:p>
             <w:r>
@@ -259,7 +238,57 @@
         </w:tc>
         <w:tc>
           <w:tcPr>
-            <w:tcW w:w="395" w:type="dxa"/>
+            <w:tcW w:w="916" w:type="dxa"/>
+          </w:tcPr>
+          <w:p>
+            <w:r>
+              <w:t>18257</w:t>
+            </w:r>
+          </w:p>
+        </w:tc>
+        <w:tc>
+          <w:tcPr>
+            <w:tcW w:w="957" w:type="dxa"/>
+          </w:tcPr>
+          <w:p>
+            <w:r>
+              <w:t>Nazfatima</w:t>
+            </w:r>
+          </w:p>
+        </w:tc>
+        <w:tc>
+          <w:tcPr>
+            <w:tcW w:w="744" w:type="dxa"/>
+          </w:tcPr>
+          <w:p>
+            <w:r>
+              <w:t>14399-D</w:t>
+            </w:r>
+          </w:p>
+        </w:tc>
+        <w:tc>
+          <w:tcPr>
+            <w:tcW w:w="1087" w:type="dxa"/>
+          </w:tcPr>
+          <w:p>
+            <w:r>
+              <w:t>akhter wahab</w:t>
+            </w:r>
+          </w:p>
+        </w:tc>
+        <w:tc>
+          <w:tcPr>
+            <w:tcW w:w="1005" w:type="dxa"/>
+          </w:tcPr>
+          <w:p>
+            <w:r>
+              <w:t>68.111765</w:t>
+            </w:r>
+          </w:p>
+        </w:tc>
+        <w:tc>
+          <w:tcPr>
+            <w:tcW w:w="1007" w:type="dxa"/>
           </w:tcPr>
           <w:p>
             <w:r>
@@ -269,67 +298,7 @@
         </w:tc>
         <w:tc>
           <w:tcPr>
-            <w:tcW w:w="840" w:type="dxa"/>
-          </w:tcPr>
-          <w:p>
-            <w:r>
-              <w:t>18257</w:t>
-            </w:r>
-          </w:p>
-        </w:tc>
-        <w:tc>
-          <w:tcPr>
-            <w:tcW w:w="876" w:type="dxa"/>
-          </w:tcPr>
-          <w:p>
-            <w:r>
-              <w:t>Nazfatima</w:t>
-            </w:r>
-          </w:p>
-        </w:tc>
-        <w:tc>
-          <w:tcPr>
-            <w:tcW w:w="687" w:type="dxa"/>
-          </w:tcPr>
-          <w:p>
-            <w:r>
-              <w:t>14399-D</w:t>
-            </w:r>
-          </w:p>
-        </w:tc>
-        <w:tc>
-          <w:tcPr>
-            <w:tcW w:w="992" w:type="dxa"/>
-          </w:tcPr>
-          <w:p>
-            <w:r>
-              <w:t>akhter wahab</w:t>
-            </w:r>
-          </w:p>
-        </w:tc>
-        <w:tc>
-          <w:tcPr>
-            <w:tcW w:w="919" w:type="dxa"/>
-          </w:tcPr>
-          <w:p>
-            <w:r>
-              <w:t>68.111765</w:t>
-            </w:r>
-          </w:p>
-        </w:tc>
-        <w:tc>
-          <w:tcPr>
-            <w:tcW w:w="921" w:type="dxa"/>
-          </w:tcPr>
-          <w:p>
-            <w:r>
-              <w:t>1</w:t>
-            </w:r>
-          </w:p>
-        </w:tc>
-        <w:tc>
-          <w:tcPr>
-            <w:tcW w:w="1201" w:type="dxa"/>
+            <w:tcW w:w="1321" w:type="dxa"/>
           </w:tcPr>
           <w:p>
             <w:r>
@@ -339,7 +308,7 @@
         </w:tc>
         <w:tc>
           <w:tcPr>
-            <w:tcW w:w="972" w:type="dxa"/>
+            <w:tcW w:w="1064" w:type="dxa"/>
           </w:tcPr>
           <w:p>
             <w:r>
@@ -349,7 +318,7 @@
         </w:tc>
         <w:tc>
           <w:tcPr>
-            <w:tcW w:w="668" w:type="dxa"/>
+            <w:tcW w:w="723" w:type="dxa"/>
           </w:tcPr>
           <w:p>
             <w:r>
@@ -361,7 +330,7 @@
       <w:tr>
         <w:tc>
           <w:tcPr>
-            <w:tcW w:w="1267" w:type="dxa"/>
+            <w:tcW w:w="406" w:type="dxa"/>
           </w:tcPr>
           <w:p>
             <w:r>
@@ -371,17 +340,7 @@
         </w:tc>
         <w:tc>
           <w:tcPr>
-            <w:tcW w:w="395" w:type="dxa"/>
-          </w:tcPr>
-          <w:p>
-            <w:r>
-              <w:t>1</w:t>
-            </w:r>
-          </w:p>
-        </w:tc>
-        <w:tc>
-          <w:tcPr>
-            <w:tcW w:w="840" w:type="dxa"/>
+            <w:tcW w:w="916" w:type="dxa"/>
           </w:tcPr>
           <w:p>
             <w:r>
@@ -391,7 +350,7 @@
         </w:tc>
         <w:tc>
           <w:tcPr>
-            <w:tcW w:w="876" w:type="dxa"/>
+            <w:tcW w:w="957" w:type="dxa"/>
           </w:tcPr>
           <w:p>
             <w:r>
@@ -401,7 +360,7 @@
         </w:tc>
         <w:tc>
           <w:tcPr>
-            <w:tcW w:w="687" w:type="dxa"/>
+            <w:tcW w:w="744" w:type="dxa"/>
           </w:tcPr>
           <w:p>
             <w:r>
@@ -411,7 +370,7 @@
         </w:tc>
         <w:tc>
           <w:tcPr>
-            <w:tcW w:w="992" w:type="dxa"/>
+            <w:tcW w:w="1087" w:type="dxa"/>
           </w:tcPr>
           <w:p>
             <w:r>
@@ -421,7 +380,7 @@
         </w:tc>
         <w:tc>
           <w:tcPr>
-            <w:tcW w:w="919" w:type="dxa"/>
+            <w:tcW w:w="1005" w:type="dxa"/>
           </w:tcPr>
           <w:p>
             <w:r>
@@ -431,7 +390,7 @@
         </w:tc>
         <w:tc>
           <w:tcPr>
-            <w:tcW w:w="921" w:type="dxa"/>
+            <w:tcW w:w="1007" w:type="dxa"/>
           </w:tcPr>
           <w:p>
             <w:r>
@@ -441,7 +400,7 @@
         </w:tc>
         <w:tc>
           <w:tcPr>
-            <w:tcW w:w="1201" w:type="dxa"/>
+            <w:tcW w:w="1321" w:type="dxa"/>
           </w:tcPr>
           <w:p>
             <w:r>
@@ -451,7 +410,7 @@
         </w:tc>
         <w:tc>
           <w:tcPr>
-            <w:tcW w:w="972" w:type="dxa"/>
+            <w:tcW w:w="1064" w:type="dxa"/>
           </w:tcPr>
           <w:p>
             <w:r>
@@ -461,7 +420,7 @@
         </w:tc>
         <w:tc>
           <w:tcPr>
-            <w:tcW w:w="668" w:type="dxa"/>
+            <w:tcW w:w="723" w:type="dxa"/>
           </w:tcPr>
           <w:p>
             <w:r>
@@ -473,7 +432,7 @@
       <w:tr>
         <w:tc>
           <w:tcPr>
-            <w:tcW w:w="1267" w:type="dxa"/>
+            <w:tcW w:w="406" w:type="dxa"/>
           </w:tcPr>
           <w:p>
             <w:r>
@@ -483,17 +442,7 @@
         </w:tc>
         <w:tc>
           <w:tcPr>
-            <w:tcW w:w="395" w:type="dxa"/>
-          </w:tcPr>
-          <w:p>
-            <w:r>
-              <w:t>1</w:t>
-            </w:r>
-          </w:p>
-        </w:tc>
-        <w:tc>
-          <w:tcPr>
-            <w:tcW w:w="840" w:type="dxa"/>
+            <w:tcW w:w="916" w:type="dxa"/>
           </w:tcPr>
           <w:p>
             <w:r>
@@ -503,7 +452,7 @@
         </w:tc>
         <w:tc>
           <w:tcPr>
-            <w:tcW w:w="876" w:type="dxa"/>
+            <w:tcW w:w="957" w:type="dxa"/>
           </w:tcPr>
           <w:p>
             <w:r>
@@ -513,7 +462,7 @@
         </w:tc>
         <w:tc>
           <w:tcPr>
-            <w:tcW w:w="687" w:type="dxa"/>
+            <w:tcW w:w="744" w:type="dxa"/>
           </w:tcPr>
           <w:p>
             <w:r>
@@ -523,7 +472,7 @@
         </w:tc>
         <w:tc>
           <w:tcPr>
-            <w:tcW w:w="992" w:type="dxa"/>
+            <w:tcW w:w="1087" w:type="dxa"/>
           </w:tcPr>
           <w:p>
             <w:r>
@@ -533,7 +482,7 @@
         </w:tc>
         <w:tc>
           <w:tcPr>
-            <w:tcW w:w="919" w:type="dxa"/>
+            <w:tcW w:w="1005" w:type="dxa"/>
           </w:tcPr>
           <w:p>
             <w:r>
@@ -543,7 +492,7 @@
         </w:tc>
         <w:tc>
           <w:tcPr>
-            <w:tcW w:w="921" w:type="dxa"/>
+            <w:tcW w:w="1007" w:type="dxa"/>
           </w:tcPr>
           <w:p>
             <w:r>
@@ -553,7 +502,7 @@
         </w:tc>
         <w:tc>
           <w:tcPr>
-            <w:tcW w:w="1201" w:type="dxa"/>
+            <w:tcW w:w="1321" w:type="dxa"/>
           </w:tcPr>
           <w:p>
             <w:r>
@@ -563,7 +512,7 @@
         </w:tc>
         <w:tc>
           <w:tcPr>
-            <w:tcW w:w="972" w:type="dxa"/>
+            <w:tcW w:w="1064" w:type="dxa"/>
           </w:tcPr>
           <w:p>
             <w:r>
@@ -573,7 +522,7 @@
         </w:tc>
         <w:tc>
           <w:tcPr>
-            <w:tcW w:w="668" w:type="dxa"/>
+            <w:tcW w:w="723" w:type="dxa"/>
           </w:tcPr>
           <w:p>
             <w:r>
@@ -585,7 +534,7 @@
       <w:tr>
         <w:tc>
           <w:tcPr>
-            <w:tcW w:w="1267" w:type="dxa"/>
+            <w:tcW w:w="406" w:type="dxa"/>
           </w:tcPr>
           <w:p>
             <w:r>
@@ -595,17 +544,7 @@
         </w:tc>
         <w:tc>
           <w:tcPr>
-            <w:tcW w:w="395" w:type="dxa"/>
-          </w:tcPr>
-          <w:p>
-            <w:r>
-              <w:t>1</w:t>
-            </w:r>
-          </w:p>
-        </w:tc>
-        <w:tc>
-          <w:tcPr>
-            <w:tcW w:w="840" w:type="dxa"/>
+            <w:tcW w:w="916" w:type="dxa"/>
           </w:tcPr>
           <w:p>
             <w:r>
@@ -615,7 +554,7 @@
         </w:tc>
         <w:tc>
           <w:tcPr>
-            <w:tcW w:w="876" w:type="dxa"/>
+            <w:tcW w:w="957" w:type="dxa"/>
           </w:tcPr>
           <w:p>
             <w:r>
@@ -625,7 +564,7 @@
         </w:tc>
         <w:tc>
           <w:tcPr>
-            <w:tcW w:w="687" w:type="dxa"/>
+            <w:tcW w:w="744" w:type="dxa"/>
           </w:tcPr>
           <w:p>
             <w:r>
@@ -635,7 +574,7 @@
         </w:tc>
         <w:tc>
           <w:tcPr>
-            <w:tcW w:w="992" w:type="dxa"/>
+            <w:tcW w:w="1087" w:type="dxa"/>
           </w:tcPr>
           <w:p>
             <w:r>
@@ -645,7 +584,7 @@
         </w:tc>
         <w:tc>
           <w:tcPr>
-            <w:tcW w:w="919" w:type="dxa"/>
+            <w:tcW w:w="1005" w:type="dxa"/>
           </w:tcPr>
           <w:p>
             <w:r>
@@ -655,7 +594,7 @@
         </w:tc>
         <w:tc>
           <w:tcPr>
-            <w:tcW w:w="921" w:type="dxa"/>
+            <w:tcW w:w="1007" w:type="dxa"/>
           </w:tcPr>
           <w:p>
             <w:r>
@@ -665,7 +604,7 @@
         </w:tc>
         <w:tc>
           <w:tcPr>
-            <w:tcW w:w="1201" w:type="dxa"/>
+            <w:tcW w:w="1321" w:type="dxa"/>
           </w:tcPr>
           <w:p>
             <w:r>
@@ -675,7 +614,7 @@
         </w:tc>
         <w:tc>
           <w:tcPr>
-            <w:tcW w:w="972" w:type="dxa"/>
+            <w:tcW w:w="1064" w:type="dxa"/>
           </w:tcPr>
           <w:p>
             <w:r>
@@ -685,7 +624,7 @@
         </w:tc>
         <w:tc>
           <w:tcPr>
-            <w:tcW w:w="668" w:type="dxa"/>
+            <w:tcW w:w="723" w:type="dxa"/>
           </w:tcPr>
           <w:p>
             <w:r>
@@ -697,7 +636,7 @@
       <w:tr>
         <w:tc>
           <w:tcPr>
-            <w:tcW w:w="1267" w:type="dxa"/>
+            <w:tcW w:w="406" w:type="dxa"/>
           </w:tcPr>
           <w:p>
             <w:r>
@@ -707,17 +646,7 @@
         </w:tc>
         <w:tc>
           <w:tcPr>
-            <w:tcW w:w="395" w:type="dxa"/>
-          </w:tcPr>
-          <w:p>
-            <w:r>
-              <w:t>1</w:t>
-            </w:r>
-          </w:p>
-        </w:tc>
-        <w:tc>
-          <w:tcPr>
-            <w:tcW w:w="840" w:type="dxa"/>
+            <w:tcW w:w="916" w:type="dxa"/>
           </w:tcPr>
           <w:p>
             <w:r>
@@ -727,7 +656,7 @@
         </w:tc>
         <w:tc>
           <w:tcPr>
-            <w:tcW w:w="876" w:type="dxa"/>
+            <w:tcW w:w="957" w:type="dxa"/>
           </w:tcPr>
           <w:p>
             <w:r>
@@ -737,7 +666,7 @@
         </w:tc>
         <w:tc>
           <w:tcPr>
-            <w:tcW w:w="687" w:type="dxa"/>
+            <w:tcW w:w="744" w:type="dxa"/>
           </w:tcPr>
           <w:p>
             <w:r>
@@ -747,7 +676,7 @@
         </w:tc>
         <w:tc>
           <w:tcPr>
-            <w:tcW w:w="992" w:type="dxa"/>
+            <w:tcW w:w="1087" w:type="dxa"/>
           </w:tcPr>
           <w:p>
             <w:r>
@@ -757,7 +686,7 @@
         </w:tc>
         <w:tc>
           <w:tcPr>
-            <w:tcW w:w="919" w:type="dxa"/>
+            <w:tcW w:w="1005" w:type="dxa"/>
           </w:tcPr>
           <w:p>
             <w:r>
@@ -767,7 +696,7 @@
         </w:tc>
         <w:tc>
           <w:tcPr>
-            <w:tcW w:w="921" w:type="dxa"/>
+            <w:tcW w:w="1007" w:type="dxa"/>
           </w:tcPr>
           <w:p>
             <w:r>
@@ -777,7 +706,7 @@
         </w:tc>
         <w:tc>
           <w:tcPr>
-            <w:tcW w:w="1201" w:type="dxa"/>
+            <w:tcW w:w="1321" w:type="dxa"/>
           </w:tcPr>
           <w:p>
             <w:r>
@@ -787,7 +716,7 @@
         </w:tc>
         <w:tc>
           <w:tcPr>
-            <w:tcW w:w="972" w:type="dxa"/>
+            <w:tcW w:w="1064" w:type="dxa"/>
           </w:tcPr>
           <w:p>
             <w:r>
@@ -797,7 +726,7 @@
         </w:tc>
         <w:tc>
           <w:tcPr>
-            <w:tcW w:w="668" w:type="dxa"/>
+            <w:tcW w:w="723" w:type="dxa"/>
           </w:tcPr>
           <w:p>
             <w:r>
@@ -809,7 +738,7 @@
       <w:tr>
         <w:tc>
           <w:tcPr>
-            <w:tcW w:w="1267" w:type="dxa"/>
+            <w:tcW w:w="406" w:type="dxa"/>
           </w:tcPr>
           <w:p>
             <w:r>
@@ -819,17 +748,7 @@
         </w:tc>
         <w:tc>
           <w:tcPr>
-            <w:tcW w:w="395" w:type="dxa"/>
-          </w:tcPr>
-          <w:p>
-            <w:r>
-              <w:t>1</w:t>
-            </w:r>
-          </w:p>
-        </w:tc>
-        <w:tc>
-          <w:tcPr>
-            <w:tcW w:w="840" w:type="dxa"/>
+            <w:tcW w:w="916" w:type="dxa"/>
           </w:tcPr>
           <w:p>
             <w:r>
@@ -839,7 +758,7 @@
         </w:tc>
         <w:tc>
           <w:tcPr>
-            <w:tcW w:w="876" w:type="dxa"/>
+            <w:tcW w:w="957" w:type="dxa"/>
           </w:tcPr>
           <w:p>
             <w:r>
@@ -849,7 +768,7 @@
         </w:tc>
         <w:tc>
           <w:tcPr>
-            <w:tcW w:w="687" w:type="dxa"/>
+            <w:tcW w:w="744" w:type="dxa"/>
           </w:tcPr>
           <w:p>
             <w:r>
@@ -859,7 +778,7 @@
         </w:tc>
         <w:tc>
           <w:tcPr>
-            <w:tcW w:w="992" w:type="dxa"/>
+            <w:tcW w:w="1087" w:type="dxa"/>
           </w:tcPr>
           <w:p>
             <w:r>
@@ -869,7 +788,7 @@
         </w:tc>
         <w:tc>
           <w:tcPr>
-            <w:tcW w:w="919" w:type="dxa"/>
+            <w:tcW w:w="1005" w:type="dxa"/>
           </w:tcPr>
           <w:p>
             <w:r>
@@ -879,7 +798,7 @@
         </w:tc>
         <w:tc>
           <w:tcPr>
-            <w:tcW w:w="921" w:type="dxa"/>
+            <w:tcW w:w="1007" w:type="dxa"/>
           </w:tcPr>
           <w:p>
             <w:r>
@@ -889,7 +808,7 @@
         </w:tc>
         <w:tc>
           <w:tcPr>
-            <w:tcW w:w="1201" w:type="dxa"/>
+            <w:tcW w:w="1321" w:type="dxa"/>
           </w:tcPr>
           <w:p>
             <w:r>
@@ -899,7 +818,7 @@
         </w:tc>
         <w:tc>
           <w:tcPr>
-            <w:tcW w:w="972" w:type="dxa"/>
+            <w:tcW w:w="1064" w:type="dxa"/>
           </w:tcPr>
           <w:p>
             <w:r>
@@ -909,7 +828,7 @@
         </w:tc>
         <w:tc>
           <w:tcPr>
-            <w:tcW w:w="668" w:type="dxa"/>
+            <w:tcW w:w="723" w:type="dxa"/>
           </w:tcPr>
           <w:p>
             <w:r>
@@ -921,7 +840,7 @@
       <w:tr>
         <w:tc>
           <w:tcPr>
-            <w:tcW w:w="1267" w:type="dxa"/>
+            <w:tcW w:w="406" w:type="dxa"/>
           </w:tcPr>
           <w:p>
             <w:r>
@@ -931,7 +850,57 @@
         </w:tc>
         <w:tc>
           <w:tcPr>
-            <w:tcW w:w="395" w:type="dxa"/>
+            <w:tcW w:w="916" w:type="dxa"/>
+          </w:tcPr>
+          <w:p>
+            <w:r>
+              <w:t>214</w:t>
+            </w:r>
+          </w:p>
+        </w:tc>
+        <w:tc>
+          <w:tcPr>
+            <w:tcW w:w="957" w:type="dxa"/>
+          </w:tcPr>
+          <w:p>
+            <w:r>
+              <w:t>Laika Tahir</w:t>
+            </w:r>
+          </w:p>
+        </w:tc>
+        <w:tc>
+          <w:tcPr>
+            <w:tcW w:w="744" w:type="dxa"/>
+          </w:tcPr>
+          <w:p>
+            <w:r>
+              <w:t>19767-D</w:t>
+            </w:r>
+          </w:p>
+        </w:tc>
+        <w:tc>
+          <w:tcPr>
+            <w:tcW w:w="1087" w:type="dxa"/>
+          </w:tcPr>
+          <w:p>
+            <w:r>
+              <w:t>Muhammad Ahsan Rehman</w:t>
+            </w:r>
+          </w:p>
+        </w:tc>
+        <w:tc>
+          <w:tcPr>
+            <w:tcW w:w="1005" w:type="dxa"/>
+          </w:tcPr>
+          <w:p>
+            <w:r>
+              <w:t>75.371429</w:t>
+            </w:r>
+          </w:p>
+        </w:tc>
+        <w:tc>
+          <w:tcPr>
+            <w:tcW w:w="1007" w:type="dxa"/>
           </w:tcPr>
           <w:p>
             <w:r>
@@ -941,67 +910,7 @@
         </w:tc>
         <w:tc>
           <w:tcPr>
-            <w:tcW w:w="840" w:type="dxa"/>
-          </w:tcPr>
-          <w:p>
-            <w:r>
-              <w:t>214</w:t>
-            </w:r>
-          </w:p>
-        </w:tc>
-        <w:tc>
-          <w:tcPr>
-            <w:tcW w:w="876" w:type="dxa"/>
-          </w:tcPr>
-          <w:p>
-            <w:r>
-              <w:t>Laika Tahir</w:t>
-            </w:r>
-          </w:p>
-        </w:tc>
-        <w:tc>
-          <w:tcPr>
-            <w:tcW w:w="687" w:type="dxa"/>
-          </w:tcPr>
-          <w:p>
-            <w:r>
-              <w:t>19767-D</w:t>
-            </w:r>
-          </w:p>
-        </w:tc>
-        <w:tc>
-          <w:tcPr>
-            <w:tcW w:w="992" w:type="dxa"/>
-          </w:tcPr>
-          <w:p>
-            <w:r>
-              <w:t>Muhammad Ahsan Rehman</w:t>
-            </w:r>
-          </w:p>
-        </w:tc>
-        <w:tc>
-          <w:tcPr>
-            <w:tcW w:w="919" w:type="dxa"/>
-          </w:tcPr>
-          <w:p>
-            <w:r>
-              <w:t>75.371429</w:t>
-            </w:r>
-          </w:p>
-        </w:tc>
-        <w:tc>
-          <w:tcPr>
-            <w:tcW w:w="921" w:type="dxa"/>
-          </w:tcPr>
-          <w:p>
-            <w:r>
-              <w:t>1</w:t>
-            </w:r>
-          </w:p>
-        </w:tc>
-        <w:tc>
-          <w:tcPr>
-            <w:tcW w:w="1201" w:type="dxa"/>
+            <w:tcW w:w="1321" w:type="dxa"/>
           </w:tcPr>
           <w:p>
             <w:r>
@@ -1011,7 +920,7 @@
         </w:tc>
         <w:tc>
           <w:tcPr>
-            <w:tcW w:w="972" w:type="dxa"/>
+            <w:tcW w:w="1064" w:type="dxa"/>
           </w:tcPr>
           <w:p>
             <w:r>
@@ -1021,7 +930,7 @@
         </w:tc>
         <w:tc>
           <w:tcPr>
-            <w:tcW w:w="668" w:type="dxa"/>
+            <w:tcW w:w="723" w:type="dxa"/>
           </w:tcPr>
           <w:p>
             <w:r>
@@ -1033,7 +942,7 @@
       <w:tr>
         <w:tc>
           <w:tcPr>
-            <w:tcW w:w="1267" w:type="dxa"/>
+            <w:tcW w:w="406" w:type="dxa"/>
           </w:tcPr>
           <w:p>
             <w:r>
@@ -1043,7 +952,57 @@
         </w:tc>
         <w:tc>
           <w:tcPr>
-            <w:tcW w:w="395" w:type="dxa"/>
+            <w:tcW w:w="916" w:type="dxa"/>
+          </w:tcPr>
+          <w:p>
+            <w:r>
+              <w:t>7612</w:t>
+            </w:r>
+          </w:p>
+        </w:tc>
+        <w:tc>
+          <w:tcPr>
+            <w:tcW w:w="957" w:type="dxa"/>
+          </w:tcPr>
+          <w:p>
+            <w:r>
+              <w:t>Atif Riaz</w:t>
+            </w:r>
+          </w:p>
+        </w:tc>
+        <w:tc>
+          <w:tcPr>
+            <w:tcW w:w="744" w:type="dxa"/>
+          </w:tcPr>
+          <w:p>
+            <w:r>
+              <w:t>21835-D</w:t>
+            </w:r>
+          </w:p>
+        </w:tc>
+        <w:tc>
+          <w:tcPr>
+            <w:tcW w:w="1087" w:type="dxa"/>
+          </w:tcPr>
+          <w:p>
+            <w:r>
+              <w:t>Riaz Qadeer</w:t>
+            </w:r>
+          </w:p>
+        </w:tc>
+        <w:tc>
+          <w:tcPr>
+            <w:tcW w:w="1005" w:type="dxa"/>
+          </w:tcPr>
+          <w:p>
+            <w:r>
+              <w:t>70.677143</w:t>
+            </w:r>
+          </w:p>
+        </w:tc>
+        <w:tc>
+          <w:tcPr>
+            <w:tcW w:w="1007" w:type="dxa"/>
           </w:tcPr>
           <w:p>
             <w:r>
@@ -1053,67 +1012,7 @@
         </w:tc>
         <w:tc>
           <w:tcPr>
-            <w:tcW w:w="840" w:type="dxa"/>
-          </w:tcPr>
-          <w:p>
-            <w:r>
-              <w:t>7612</w:t>
-            </w:r>
-          </w:p>
-        </w:tc>
-        <w:tc>
-          <w:tcPr>
-            <w:tcW w:w="876" w:type="dxa"/>
-          </w:tcPr>
-          <w:p>
-            <w:r>
-              <w:t>Atif Riaz</w:t>
-            </w:r>
-          </w:p>
-        </w:tc>
-        <w:tc>
-          <w:tcPr>
-            <w:tcW w:w="687" w:type="dxa"/>
-          </w:tcPr>
-          <w:p>
-            <w:r>
-              <w:t>21835-D</w:t>
-            </w:r>
-          </w:p>
-        </w:tc>
-        <w:tc>
-          <w:tcPr>
-            <w:tcW w:w="992" w:type="dxa"/>
-          </w:tcPr>
-          <w:p>
-            <w:r>
-              <w:t>Riaz Qadeer</w:t>
-            </w:r>
-          </w:p>
-        </w:tc>
-        <w:tc>
-          <w:tcPr>
-            <w:tcW w:w="919" w:type="dxa"/>
-          </w:tcPr>
-          <w:p>
-            <w:r>
-              <w:t>70.677143</w:t>
-            </w:r>
-          </w:p>
-        </w:tc>
-        <w:tc>
-          <w:tcPr>
-            <w:tcW w:w="921" w:type="dxa"/>
-          </w:tcPr>
-          <w:p>
-            <w:r>
-              <w:t>1</w:t>
-            </w:r>
-          </w:p>
-        </w:tc>
-        <w:tc>
-          <w:tcPr>
-            <w:tcW w:w="1201" w:type="dxa"/>
+            <w:tcW w:w="1321" w:type="dxa"/>
           </w:tcPr>
           <w:p>
             <w:r>
@@ -1123,7 +1022,7 @@
         </w:tc>
         <w:tc>
           <w:tcPr>
-            <w:tcW w:w="972" w:type="dxa"/>
+            <w:tcW w:w="1064" w:type="dxa"/>
           </w:tcPr>
           <w:p>
             <w:r>
@@ -1133,7 +1032,7 @@
         </w:tc>
         <w:tc>
           <w:tcPr>
-            <w:tcW w:w="668" w:type="dxa"/>
+            <w:tcW w:w="723" w:type="dxa"/>
           </w:tcPr>
           <w:p>
             <w:r>
@@ -1145,7 +1044,7 @@
       <w:tr>
         <w:tc>
           <w:tcPr>
-            <w:tcW w:w="1267" w:type="dxa"/>
+            <w:tcW w:w="406" w:type="dxa"/>
           </w:tcPr>
           <w:p>
             <w:r>
@@ -1155,17 +1054,7 @@
         </w:tc>
         <w:tc>
           <w:tcPr>
-            <w:tcW w:w="395" w:type="dxa"/>
-          </w:tcPr>
-          <w:p>
-            <w:r>
-              <w:t>1</w:t>
-            </w:r>
-          </w:p>
-        </w:tc>
-        <w:tc>
-          <w:tcPr>
-            <w:tcW w:w="840" w:type="dxa"/>
+            <w:tcW w:w="916" w:type="dxa"/>
           </w:tcPr>
           <w:p>
             <w:r>
@@ -1175,7 +1064,7 @@
         </w:tc>
         <w:tc>
           <w:tcPr>
-            <w:tcW w:w="876" w:type="dxa"/>
+            <w:tcW w:w="957" w:type="dxa"/>
           </w:tcPr>
           <w:p>
             <w:r>
@@ -1185,7 +1074,7 @@
         </w:tc>
         <w:tc>
           <w:tcPr>
-            <w:tcW w:w="687" w:type="dxa"/>
+            <w:tcW w:w="744" w:type="dxa"/>
           </w:tcPr>
           <w:p>
             <w:r>
@@ -1195,7 +1084,7 @@
         </w:tc>
         <w:tc>
           <w:tcPr>
-            <w:tcW w:w="992" w:type="dxa"/>
+            <w:tcW w:w="1087" w:type="dxa"/>
           </w:tcPr>
           <w:p>
             <w:r>
@@ -1205,7 +1094,7 @@
         </w:tc>
         <w:tc>
           <w:tcPr>
-            <w:tcW w:w="919" w:type="dxa"/>
+            <w:tcW w:w="1005" w:type="dxa"/>
           </w:tcPr>
           <w:p>
             <w:r>
@@ -1215,7 +1104,7 @@
         </w:tc>
         <w:tc>
           <w:tcPr>
-            <w:tcW w:w="921" w:type="dxa"/>
+            <w:tcW w:w="1007" w:type="dxa"/>
           </w:tcPr>
           <w:p>
             <w:r>
@@ -1225,7 +1114,7 @@
         </w:tc>
         <w:tc>
           <w:tcPr>
-            <w:tcW w:w="1201" w:type="dxa"/>
+            <w:tcW w:w="1321" w:type="dxa"/>
           </w:tcPr>
           <w:p>
             <w:r>
@@ -1235,25 +1124,20 @@
         </w:tc>
         <w:tc>
           <w:tcPr>
-            <w:tcW w:w="972" w:type="dxa"/>
-          </w:tcPr>
-          <w:p>
-            <w:r>
-              <w:t>Nishtar Institute of Dentistr</w:t>
-            </w:r>
-            <w:r>
-              <w:lastRenderedPageBreak/>
-              <w:t>y, Multan</w:t>
-            </w:r>
-          </w:p>
-        </w:tc>
-        <w:tc>
-          <w:tcPr>
-            <w:tcW w:w="668" w:type="dxa"/>
-          </w:tcPr>
-          <w:p>
-            <w:r>
-              <w:lastRenderedPageBreak/>
+            <w:tcW w:w="1064" w:type="dxa"/>
+          </w:tcPr>
+          <w:p>
+            <w:r>
+              <w:t>Nishtar Institute of Dentistry, Multan</w:t>
+            </w:r>
+          </w:p>
+        </w:tc>
+        <w:tc>
+          <w:tcPr>
+            <w:tcW w:w="723" w:type="dxa"/>
+          </w:tcPr>
+          <w:p>
+            <w:r>
               <w:t>Punjab</w:t>
             </w:r>
           </w:p>
@@ -1262,77 +1146,87 @@
       <w:tr>
         <w:tc>
           <w:tcPr>
-            <w:tcW w:w="1267" w:type="dxa"/>
-          </w:tcPr>
-          <w:p>
-            <w:r>
-              <w:t>11</w:t>
-            </w:r>
-          </w:p>
-        </w:tc>
-        <w:tc>
-          <w:tcPr>
-            <w:tcW w:w="395" w:type="dxa"/>
+            <w:tcW w:w="406" w:type="dxa"/>
           </w:tcPr>
           <w:p>
             <w:r>
               <w:t>1</w:t>
             </w:r>
-          </w:p>
-        </w:tc>
-        <w:tc>
-          <w:tcPr>
-            <w:tcW w:w="840" w:type="dxa"/>
-          </w:tcPr>
-          <w:p>
-            <w:r>
+            <w:r>
+              <w:lastRenderedPageBreak/>
+              <w:t>1</w:t>
+            </w:r>
+          </w:p>
+        </w:tc>
+        <w:tc>
+          <w:tcPr>
+            <w:tcW w:w="916" w:type="dxa"/>
+          </w:tcPr>
+          <w:p>
+            <w:r>
+              <w:lastRenderedPageBreak/>
               <w:t>18088</w:t>
             </w:r>
           </w:p>
         </w:tc>
         <w:tc>
           <w:tcPr>
-            <w:tcW w:w="876" w:type="dxa"/>
-          </w:tcPr>
-          <w:p>
-            <w:r>
-              <w:t>Ali Murtaza Haider</w:t>
-            </w:r>
-          </w:p>
-        </w:tc>
-        <w:tc>
-          <w:tcPr>
-            <w:tcW w:w="687" w:type="dxa"/>
-          </w:tcPr>
-          <w:p>
-            <w:r>
-              <w:t>22842-D</w:t>
-            </w:r>
-          </w:p>
-        </w:tc>
-        <w:tc>
-          <w:tcPr>
-            <w:tcW w:w="992" w:type="dxa"/>
-          </w:tcPr>
-          <w:p>
-            <w:r>
-              <w:t>Fazal Din Anjum</w:t>
-            </w:r>
-          </w:p>
-        </w:tc>
-        <w:tc>
-          <w:tcPr>
-            <w:tcW w:w="919" w:type="dxa"/>
-          </w:tcPr>
-          <w:p>
-            <w:r>
+            <w:tcW w:w="957" w:type="dxa"/>
+          </w:tcPr>
+          <w:p>
+            <w:r>
+              <w:t xml:space="preserve">Ali </w:t>
+            </w:r>
+            <w:r>
+              <w:lastRenderedPageBreak/>
+              <w:t>Murtaza Haider</w:t>
+            </w:r>
+          </w:p>
+        </w:tc>
+        <w:tc>
+          <w:tcPr>
+            <w:tcW w:w="744" w:type="dxa"/>
+          </w:tcPr>
+          <w:p>
+            <w:r>
+              <w:lastRenderedPageBreak/>
+              <w:t>2284</w:t>
+            </w:r>
+            <w:r>
+              <w:lastRenderedPageBreak/>
+              <w:t>2-D</w:t>
+            </w:r>
+          </w:p>
+        </w:tc>
+        <w:tc>
+          <w:tcPr>
+            <w:tcW w:w="1087" w:type="dxa"/>
+          </w:tcPr>
+          <w:p>
+            <w:r>
+              <w:lastRenderedPageBreak/>
+              <w:t xml:space="preserve">Fazal Din </w:t>
+            </w:r>
+            <w:r>
+              <w:lastRenderedPageBreak/>
+              <w:t>Anjum</w:t>
+            </w:r>
+          </w:p>
+        </w:tc>
+        <w:tc>
+          <w:tcPr>
+            <w:tcW w:w="1005" w:type="dxa"/>
+          </w:tcPr>
+          <w:p>
+            <w:r>
+              <w:lastRenderedPageBreak/>
               <w:t>68.64</w:t>
             </w:r>
           </w:p>
         </w:tc>
         <w:tc>
           <w:tcPr>
-            <w:tcW w:w="921" w:type="dxa"/>
+            <w:tcW w:w="1007" w:type="dxa"/>
           </w:tcPr>
           <w:p>
             <w:r>
@@ -1342,31 +1236,45 @@
         </w:tc>
         <w:tc>
           <w:tcPr>
-            <w:tcW w:w="1201" w:type="dxa"/>
-          </w:tcPr>
-          <w:p>
-            <w:r>
-              <w:t>Orthodontics</w:t>
-            </w:r>
-          </w:p>
-        </w:tc>
-        <w:tc>
-          <w:tcPr>
-            <w:tcW w:w="972" w:type="dxa"/>
-          </w:tcPr>
-          <w:p>
-            <w:r>
-              <w:t>Punjab Dental Hospital, Lahore</w:t>
-            </w:r>
-          </w:p>
-        </w:tc>
-        <w:tc>
-          <w:tcPr>
-            <w:tcW w:w="668" w:type="dxa"/>
-          </w:tcPr>
-          <w:p>
-            <w:r>
-              <w:t>Punjab</w:t>
+            <w:tcW w:w="1321" w:type="dxa"/>
+          </w:tcPr>
+          <w:p>
+            <w:r>
+              <w:t>Orthodontic</w:t>
+            </w:r>
+            <w:r>
+              <w:lastRenderedPageBreak/>
+              <w:t>s</w:t>
+            </w:r>
+          </w:p>
+        </w:tc>
+        <w:tc>
+          <w:tcPr>
+            <w:tcW w:w="1064" w:type="dxa"/>
+          </w:tcPr>
+          <w:p>
+            <w:r>
+              <w:lastRenderedPageBreak/>
+              <w:t xml:space="preserve">Punjab </w:t>
+            </w:r>
+            <w:r>
+              <w:lastRenderedPageBreak/>
+              <w:t>Dental Hospital, Lahore</w:t>
+            </w:r>
+          </w:p>
+        </w:tc>
+        <w:tc>
+          <w:tcPr>
+            <w:tcW w:w="723" w:type="dxa"/>
+          </w:tcPr>
+          <w:p>
+            <w:r>
+              <w:lastRenderedPageBreak/>
+              <w:t>Punja</w:t>
+            </w:r>
+            <w:r>
+              <w:lastRenderedPageBreak/>
+              <w:t>b</w:t>
             </w:r>
           </w:p>
         </w:tc>
@@ -1374,27 +1282,18 @@
       <w:tr>
         <w:tc>
           <w:tcPr>
-            <w:tcW w:w="1267" w:type="dxa"/>
-          </w:tcPr>
-          <w:p>
-            <w:r>
+            <w:tcW w:w="406" w:type="dxa"/>
+          </w:tcPr>
+          <w:p>
+            <w:r>
+              <w:lastRenderedPageBreak/>
               <w:t>12</w:t>
             </w:r>
           </w:p>
         </w:tc>
         <w:tc>
           <w:tcPr>
-            <w:tcW w:w="395" w:type="dxa"/>
-          </w:tcPr>
-          <w:p>
-            <w:r>
-              <w:t>2</w:t>
-            </w:r>
-          </w:p>
-        </w:tc>
-        <w:tc>
-          <w:tcPr>
-            <w:tcW w:w="840" w:type="dxa"/>
+            <w:tcW w:w="916" w:type="dxa"/>
           </w:tcPr>
           <w:p>
             <w:r>
@@ -1404,7 +1303,7 @@
         </w:tc>
         <w:tc>
           <w:tcPr>
-            <w:tcW w:w="876" w:type="dxa"/>
+            <w:tcW w:w="957" w:type="dxa"/>
           </w:tcPr>
           <w:p>
             <w:r>
@@ -1414,7 +1313,7 @@
         </w:tc>
         <w:tc>
           <w:tcPr>
-            <w:tcW w:w="687" w:type="dxa"/>
+            <w:tcW w:w="744" w:type="dxa"/>
           </w:tcPr>
           <w:p>
             <w:r>
@@ -1424,7 +1323,7 @@
         </w:tc>
         <w:tc>
           <w:tcPr>
-            <w:tcW w:w="992" w:type="dxa"/>
+            <w:tcW w:w="1087" w:type="dxa"/>
           </w:tcPr>
           <w:p>
             <w:r>
@@ -1434,7 +1333,7 @@
         </w:tc>
         <w:tc>
           <w:tcPr>
-            <w:tcW w:w="919" w:type="dxa"/>
+            <w:tcW w:w="1005" w:type="dxa"/>
           </w:tcPr>
           <w:p>
             <w:r>
@@ -1444,7 +1343,7 @@
         </w:tc>
         <w:tc>
           <w:tcPr>
-            <w:tcW w:w="921" w:type="dxa"/>
+            <w:tcW w:w="1007" w:type="dxa"/>
           </w:tcPr>
           <w:p>
             <w:r>
@@ -1454,7 +1353,7 @@
         </w:tc>
         <w:tc>
           <w:tcPr>
-            <w:tcW w:w="1201" w:type="dxa"/>
+            <w:tcW w:w="1321" w:type="dxa"/>
           </w:tcPr>
           <w:p>
             <w:r>
@@ -1464,7 +1363,7 @@
         </w:tc>
         <w:tc>
           <w:tcPr>
-            <w:tcW w:w="972" w:type="dxa"/>
+            <w:tcW w:w="1064" w:type="dxa"/>
           </w:tcPr>
           <w:p>
             <w:r>
@@ -1474,7 +1373,7 @@
         </w:tc>
         <w:tc>
           <w:tcPr>
-            <w:tcW w:w="668" w:type="dxa"/>
+            <w:tcW w:w="723" w:type="dxa"/>
           </w:tcPr>
           <w:p>
             <w:r>
@@ -1486,7 +1385,7 @@
       <w:tr>
         <w:tc>
           <w:tcPr>
-            <w:tcW w:w="1267" w:type="dxa"/>
+            <w:tcW w:w="406" w:type="dxa"/>
           </w:tcPr>
           <w:p>
             <w:r>
@@ -1496,7 +1395,57 @@
         </w:tc>
         <w:tc>
           <w:tcPr>
-            <w:tcW w:w="395" w:type="dxa"/>
+            <w:tcW w:w="916" w:type="dxa"/>
+          </w:tcPr>
+          <w:p>
+            <w:r>
+              <w:t>1264</w:t>
+            </w:r>
+          </w:p>
+        </w:tc>
+        <w:tc>
+          <w:tcPr>
+            <w:tcW w:w="957" w:type="dxa"/>
+          </w:tcPr>
+          <w:p>
+            <w:r>
+              <w:t>Maria Qurban</w:t>
+            </w:r>
+          </w:p>
+        </w:tc>
+        <w:tc>
+          <w:tcPr>
+            <w:tcW w:w="744" w:type="dxa"/>
+          </w:tcPr>
+          <w:p>
+            <w:r>
+              <w:t>19577-D</w:t>
+            </w:r>
+          </w:p>
+        </w:tc>
+        <w:tc>
+          <w:tcPr>
+            <w:tcW w:w="1087" w:type="dxa"/>
+          </w:tcPr>
+          <w:p>
+            <w:r>
+              <w:t>Muhammad nouman tariq</w:t>
+            </w:r>
+          </w:p>
+        </w:tc>
+        <w:tc>
+          <w:tcPr>
+            <w:tcW w:w="1005" w:type="dxa"/>
+          </w:tcPr>
+          <w:p>
+            <w:r>
+              <w:t>69.477778</w:t>
+            </w:r>
+          </w:p>
+        </w:tc>
+        <w:tc>
+          <w:tcPr>
+            <w:tcW w:w="1007" w:type="dxa"/>
           </w:tcPr>
           <w:p>
             <w:r>
@@ -1506,67 +1455,7 @@
         </w:tc>
         <w:tc>
           <w:tcPr>
-            <w:tcW w:w="840" w:type="dxa"/>
-          </w:tcPr>
-          <w:p>
-            <w:r>
-              <w:t>1264</w:t>
-            </w:r>
-          </w:p>
-        </w:tc>
-        <w:tc>
-          <w:tcPr>
-            <w:tcW w:w="876" w:type="dxa"/>
-          </w:tcPr>
-          <w:p>
-            <w:r>
-              <w:t>Maria Qurban</w:t>
-            </w:r>
-          </w:p>
-        </w:tc>
-        <w:tc>
-          <w:tcPr>
-            <w:tcW w:w="687" w:type="dxa"/>
-          </w:tcPr>
-          <w:p>
-            <w:r>
-              <w:t>19577-D</w:t>
-            </w:r>
-          </w:p>
-        </w:tc>
-        <w:tc>
-          <w:tcPr>
-            <w:tcW w:w="992" w:type="dxa"/>
-          </w:tcPr>
-          <w:p>
-            <w:r>
-              <w:t>Muhammad nouman tariq</w:t>
-            </w:r>
-          </w:p>
-        </w:tc>
-        <w:tc>
-          <w:tcPr>
-            <w:tcW w:w="919" w:type="dxa"/>
-          </w:tcPr>
-          <w:p>
-            <w:r>
-              <w:t>69.477778</w:t>
-            </w:r>
-          </w:p>
-        </w:tc>
-        <w:tc>
-          <w:tcPr>
-            <w:tcW w:w="921" w:type="dxa"/>
-          </w:tcPr>
-          <w:p>
-            <w:r>
-              <w:t>1</w:t>
-            </w:r>
-          </w:p>
-        </w:tc>
-        <w:tc>
-          <w:tcPr>
-            <w:tcW w:w="1201" w:type="dxa"/>
+            <w:tcW w:w="1321" w:type="dxa"/>
           </w:tcPr>
           <w:p>
             <w:r>
@@ -1576,7 +1465,7 @@
         </w:tc>
         <w:tc>
           <w:tcPr>
-            <w:tcW w:w="972" w:type="dxa"/>
+            <w:tcW w:w="1064" w:type="dxa"/>
           </w:tcPr>
           <w:p>
             <w:r>
@@ -1586,7 +1475,7 @@
         </w:tc>
         <w:tc>
           <w:tcPr>
-            <w:tcW w:w="668" w:type="dxa"/>
+            <w:tcW w:w="723" w:type="dxa"/>
           </w:tcPr>
           <w:p>
             <w:r>
@@ -1598,7 +1487,7 @@
       <w:tr>
         <w:tc>
           <w:tcPr>
-            <w:tcW w:w="1267" w:type="dxa"/>
+            <w:tcW w:w="406" w:type="dxa"/>
           </w:tcPr>
           <w:p>
             <w:r>
@@ -1608,7 +1497,57 @@
         </w:tc>
         <w:tc>
           <w:tcPr>
-            <w:tcW w:w="395" w:type="dxa"/>
+            <w:tcW w:w="916" w:type="dxa"/>
+          </w:tcPr>
+          <w:p>
+            <w:r>
+              <w:t>6967</w:t>
+            </w:r>
+          </w:p>
+        </w:tc>
+        <w:tc>
+          <w:tcPr>
+            <w:tcW w:w="957" w:type="dxa"/>
+          </w:tcPr>
+          <w:p>
+            <w:r>
+              <w:t>Zaufia Altaf</w:t>
+            </w:r>
+          </w:p>
+        </w:tc>
+        <w:tc>
+          <w:tcPr>
+            <w:tcW w:w="744" w:type="dxa"/>
+          </w:tcPr>
+          <w:p>
+            <w:r>
+              <w:t>24252-D</w:t>
+            </w:r>
+          </w:p>
+        </w:tc>
+        <w:tc>
+          <w:tcPr>
+            <w:tcW w:w="1087" w:type="dxa"/>
+          </w:tcPr>
+          <w:p>
+            <w:r>
+              <w:t>Muhammad Altaf Khan</w:t>
+            </w:r>
+          </w:p>
+        </w:tc>
+        <w:tc>
+          <w:tcPr>
+            <w:tcW w:w="1005" w:type="dxa"/>
+          </w:tcPr>
+          <w:p>
+            <w:r>
+              <w:t>59.177143</w:t>
+            </w:r>
+          </w:p>
+        </w:tc>
+        <w:tc>
+          <w:tcPr>
+            <w:tcW w:w="1007" w:type="dxa"/>
           </w:tcPr>
           <w:p>
             <w:r>
@@ -1618,67 +1557,7 @@
         </w:tc>
         <w:tc>
           <w:tcPr>
-            <w:tcW w:w="840" w:type="dxa"/>
-          </w:tcPr>
-          <w:p>
-            <w:r>
-              <w:t>6967</w:t>
-            </w:r>
-          </w:p>
-        </w:tc>
-        <w:tc>
-          <w:tcPr>
-            <w:tcW w:w="876" w:type="dxa"/>
-          </w:tcPr>
-          <w:p>
-            <w:r>
-              <w:t>Zaufia Altaf</w:t>
-            </w:r>
-          </w:p>
-        </w:tc>
-        <w:tc>
-          <w:tcPr>
-            <w:tcW w:w="687" w:type="dxa"/>
-          </w:tcPr>
-          <w:p>
-            <w:r>
-              <w:t>24252-D</w:t>
-            </w:r>
-          </w:p>
-        </w:tc>
-        <w:tc>
-          <w:tcPr>
-            <w:tcW w:w="992" w:type="dxa"/>
-          </w:tcPr>
-          <w:p>
-            <w:r>
-              <w:t>Muhammad Altaf Khan</w:t>
-            </w:r>
-          </w:p>
-        </w:tc>
-        <w:tc>
-          <w:tcPr>
-            <w:tcW w:w="919" w:type="dxa"/>
-          </w:tcPr>
-          <w:p>
-            <w:r>
-              <w:t>59.177143</w:t>
-            </w:r>
-          </w:p>
-        </w:tc>
-        <w:tc>
-          <w:tcPr>
-            <w:tcW w:w="921" w:type="dxa"/>
-          </w:tcPr>
-          <w:p>
-            <w:r>
-              <w:t>1</w:t>
-            </w:r>
-          </w:p>
-        </w:tc>
-        <w:tc>
-          <w:tcPr>
-            <w:tcW w:w="1201" w:type="dxa"/>
+            <w:tcW w:w="1321" w:type="dxa"/>
           </w:tcPr>
           <w:p>
             <w:r>
@@ -1688,7 +1567,7 @@
         </w:tc>
         <w:tc>
           <w:tcPr>
-            <w:tcW w:w="972" w:type="dxa"/>
+            <w:tcW w:w="1064" w:type="dxa"/>
           </w:tcPr>
           <w:p>
             <w:r>
@@ -1698,7 +1577,7 @@
         </w:tc>
         <w:tc>
           <w:tcPr>
-            <w:tcW w:w="668" w:type="dxa"/>
+            <w:tcW w:w="723" w:type="dxa"/>
           </w:tcPr>
           <w:p>
             <w:r>
@@ -1892,31 +1771,31 @@
       </w:rPr>
     </w:lvl>
   </w:abstractNum>
-  <w:num w:numId="1" w16cid:durableId="342512132">
+  <w:num w:numId="1" w16cid:durableId="693654510">
     <w:abstractNumId w:val="8"/>
   </w:num>
-  <w:num w:numId="2" w16cid:durableId="1678650774">
+  <w:num w:numId="2" w16cid:durableId="1530486449">
     <w:abstractNumId w:val="6"/>
   </w:num>
-  <w:num w:numId="3" w16cid:durableId="1787120667">
+  <w:num w:numId="3" w16cid:durableId="1517839964">
     <w:abstractNumId w:val="5"/>
   </w:num>
-  <w:num w:numId="4" w16cid:durableId="1716544299">
+  <w:num w:numId="4" w16cid:durableId="1913158373">
     <w:abstractNumId w:val="4"/>
   </w:num>
-  <w:num w:numId="5" w16cid:durableId="381367023">
+  <w:num w:numId="5" w16cid:durableId="1878159019">
     <w:abstractNumId w:val="7"/>
   </w:num>
-  <w:num w:numId="6" w16cid:durableId="1664509319">
+  <w:num w:numId="6" w16cid:durableId="1762950422">
     <w:abstractNumId w:val="3"/>
   </w:num>
-  <w:num w:numId="7" w16cid:durableId="1280647741">
+  <w:num w:numId="7" w16cid:durableId="312761104">
     <w:abstractNumId w:val="2"/>
   </w:num>
-  <w:num w:numId="8" w16cid:durableId="2067608186">
+  <w:num w:numId="8" w16cid:durableId="2033070696">
     <w:abstractNumId w:val="1"/>
   </w:num>
-  <w:num w:numId="9" w16cid:durableId="1596741142">
+  <w:num w:numId="9" w16cid:durableId="264072016">
     <w:abstractNumId w:val="0"/>
   </w:num>
 </w:numbering>

</xml_diff>